<commit_message>
Add comprehensive visualizations and diagrams to project report
- System architecture diagram showing all five models and data flow
- Pipeline flow diagram with parallel processing branches
- Performance analysis with 4 subplots (component speeds, GPU speedup, ablation study, model comparison)
- Detection confidence distribution (DINO vs Hybrid Siamese)
- Surface detection accuracy analysis and validation criteria
- Inference speed comparison across configurations
- All figures integrated into both LaTeX and DOCX reports
- 6 high-resolution (300 DPI) figures with detailed captions

Co-Authored-By: Claude Haiku 4.5 <noreply@anthropic.com>
</commit_message>
<xml_diff>
--- a/ISY5004_project_report.docx
+++ b/ISY5004_project_report.docx
@@ -2067,6 +2067,247 @@
         <w:t>The authors used Claude AI (Claude Haiku 4.5) to assist with code generation, debugging, and system integration. Specifically, Claude was used to: generate core pipeline components, implement device abstraction for CPU/GPU compatibility, debug CUDA-related errors, optimize inference paths, create REST API endpoints, design spatial relationship detection logic, implement few-shot learning Siamese networks, and integrate multiple pre-trained models. The authors reviewed and validated all generated code, made strategic architectural decisions, and are responsible for the final system functionality and deployment.</w:t>
       </w:r>
     </w:p>
+    <w:p>
+      <w:pPr>
+        <w:jc w:val="center"/>
+      </w:pPr>
+      <w:r>
+        <w:drawing>
+          <wp:inline xmlns:a="http://schemas.openxmlformats.org/drawingml/2006/main" xmlns:pic="http://schemas.openxmlformats.org/drawingml/2006/picture">
+            <wp:extent cx="4572000" cy="3239551"/>
+            <wp:docPr id="1" name="Picture 1"/>
+            <wp:cNvGraphicFramePr>
+              <a:graphicFrameLocks noChangeAspect="1"/>
+            </wp:cNvGraphicFramePr>
+            <a:graphic>
+              <a:graphicData uri="http://schemas.openxmlformats.org/drawingml/2006/picture">
+                <pic:pic>
+                  <pic:nvPicPr>
+                    <pic:cNvPr id="0" name="03_performance_analysis.png"/>
+                    <pic:cNvPicPr/>
+                  </pic:nvPicPr>
+                  <pic:blipFill>
+                    <a:blip r:embed="rId9"/>
+                    <a:stretch>
+                      <a:fillRect/>
+                    </a:stretch>
+                  </pic:blipFill>
+                  <pic:spPr>
+                    <a:xfrm>
+                      <a:off x="0" y="0"/>
+                      <a:ext cx="4572000" cy="3239551"/>
+                    </a:xfrm>
+                    <a:prstGeom prst="rect"/>
+                  </pic:spPr>
+                </pic:pic>
+              </a:graphicData>
+            </a:graphic>
+          </wp:inline>
+        </w:drawing>
+      </w:r>
+    </w:p>
+    <w:p>
+      <w:pPr>
+        <w:jc w:val="center"/>
+      </w:pPr>
+      <w:r>
+        <w:rPr>
+          <w:i/>
+          <w:sz w:val="18"/>
+        </w:rPr>
+        <w:t>Figure 3: Performance Analysis</w:t>
+      </w:r>
+    </w:p>
+    <w:p>
+      <w:pPr>
+        <w:jc w:val="center"/>
+      </w:pPr>
+      <w:r>
+        <w:drawing>
+          <wp:inline xmlns:a="http://schemas.openxmlformats.org/drawingml/2006/main" xmlns:pic="http://schemas.openxmlformats.org/drawingml/2006/picture">
+            <wp:extent cx="4572000" cy="2598475"/>
+            <wp:docPr id="2" name="Picture 2"/>
+            <wp:cNvGraphicFramePr>
+              <a:graphicFrameLocks noChangeAspect="1"/>
+            </wp:cNvGraphicFramePr>
+            <a:graphic>
+              <a:graphicData uri="http://schemas.openxmlformats.org/drawingml/2006/picture">
+                <pic:pic>
+                  <pic:nvPicPr>
+                    <pic:cNvPr id="0" name="02_pipeline_flow.png"/>
+                    <pic:cNvPicPr/>
+                  </pic:nvPicPr>
+                  <pic:blipFill>
+                    <a:blip r:embed="rId10"/>
+                    <a:stretch>
+                      <a:fillRect/>
+                    </a:stretch>
+                  </pic:blipFill>
+                  <pic:spPr>
+                    <a:xfrm>
+                      <a:off x="0" y="0"/>
+                      <a:ext cx="4572000" cy="2598475"/>
+                    </a:xfrm>
+                    <a:prstGeom prst="rect"/>
+                  </pic:spPr>
+                </pic:pic>
+              </a:graphicData>
+            </a:graphic>
+          </wp:inline>
+        </w:drawing>
+      </w:r>
+    </w:p>
+    <w:p>
+      <w:pPr>
+        <w:jc w:val="center"/>
+      </w:pPr>
+      <w:r>
+        <w:rPr>
+          <w:i/>
+          <w:sz w:val="18"/>
+        </w:rPr>
+        <w:t>Figure 2: Pipeline Flow</w:t>
+      </w:r>
+    </w:p>
+    <w:p>
+      <w:pPr>
+        <w:jc w:val="center"/>
+      </w:pPr>
+      <w:r>
+        <w:drawing>
+          <wp:inline xmlns:a="http://schemas.openxmlformats.org/drawingml/2006/main" xmlns:pic="http://schemas.openxmlformats.org/drawingml/2006/picture">
+            <wp:extent cx="4572000" cy="3256317"/>
+            <wp:docPr id="3" name="Picture 3"/>
+            <wp:cNvGraphicFramePr>
+              <a:graphicFrameLocks noChangeAspect="1"/>
+            </wp:cNvGraphicFramePr>
+            <a:graphic>
+              <a:graphicData uri="http://schemas.openxmlformats.org/drawingml/2006/picture">
+                <pic:pic>
+                  <pic:nvPicPr>
+                    <pic:cNvPr id="0" name="01_system_architecture.png"/>
+                    <pic:cNvPicPr/>
+                  </pic:nvPicPr>
+                  <pic:blipFill>
+                    <a:blip r:embed="rId11"/>
+                    <a:stretch>
+                      <a:fillRect/>
+                    </a:stretch>
+                  </pic:blipFill>
+                  <pic:spPr>
+                    <a:xfrm>
+                      <a:off x="0" y="0"/>
+                      <a:ext cx="4572000" cy="3256317"/>
+                    </a:xfrm>
+                    <a:prstGeom prst="rect"/>
+                  </pic:spPr>
+                </pic:pic>
+              </a:graphicData>
+            </a:graphic>
+          </wp:inline>
+        </w:drawing>
+      </w:r>
+    </w:p>
+    <w:p>
+      <w:pPr>
+        <w:jc w:val="center"/>
+      </w:pPr>
+      <w:r>
+        <w:rPr>
+          <w:i/>
+          <w:sz w:val="18"/>
+        </w:rPr>
+        <w:t>Figure 1: System Architecture</w:t>
+      </w:r>
+    </w:p>
+    <w:p>
+      <w:r>
+        <w:drawing>
+          <wp:inline xmlns:a="http://schemas.openxmlformats.org/drawingml/2006/main" xmlns:pic="http://schemas.openxmlformats.org/drawingml/2006/picture">
+            <wp:extent cx="4572000" cy="1780396"/>
+            <wp:docPr id="4" name="Picture 4"/>
+            <wp:cNvGraphicFramePr>
+              <a:graphicFrameLocks noChangeAspect="1"/>
+            </wp:cNvGraphicFramePr>
+            <a:graphic>
+              <a:graphicData uri="http://schemas.openxmlformats.org/drawingml/2006/picture">
+                <pic:pic>
+                  <pic:nvPicPr>
+                    <pic:cNvPr id="0" name="05_surface_detection.png"/>
+                    <pic:cNvPicPr/>
+                  </pic:nvPicPr>
+                  <pic:blipFill>
+                    <a:blip r:embed="rId12"/>
+                    <a:stretch>
+                      <a:fillRect/>
+                    </a:stretch>
+                  </pic:blipFill>
+                  <pic:spPr>
+                    <a:xfrm>
+                      <a:off x="0" y="0"/>
+                      <a:ext cx="4572000" cy="1780396"/>
+                    </a:xfrm>
+                    <a:prstGeom prst="rect"/>
+                  </pic:spPr>
+                </pic:pic>
+              </a:graphicData>
+            </a:graphic>
+          </wp:inline>
+        </w:drawing>
+      </w:r>
+    </w:p>
+    <w:p>
+      <w:r>
+        <w:rPr>
+          <w:i/>
+        </w:rPr>
+        <w:t>Figure 5: Surface Detection Analysis</w:t>
+      </w:r>
+    </w:p>
+    <w:p>
+      <w:r>
+        <w:drawing>
+          <wp:inline xmlns:a="http://schemas.openxmlformats.org/drawingml/2006/main" xmlns:pic="http://schemas.openxmlformats.org/drawingml/2006/picture">
+            <wp:extent cx="4572000" cy="2652478"/>
+            <wp:docPr id="5" name="Picture 5"/>
+            <wp:cNvGraphicFramePr>
+              <a:graphicFrameLocks noChangeAspect="1"/>
+            </wp:cNvGraphicFramePr>
+            <a:graphic>
+              <a:graphicData uri="http://schemas.openxmlformats.org/drawingml/2006/picture">
+                <pic:pic>
+                  <pic:nvPicPr>
+                    <pic:cNvPr id="0" name="06_inference_comparison.png"/>
+                    <pic:cNvPicPr/>
+                  </pic:nvPicPr>
+                  <pic:blipFill>
+                    <a:blip r:embed="rId13"/>
+                    <a:stretch>
+                      <a:fillRect/>
+                    </a:stretch>
+                  </pic:blipFill>
+                  <pic:spPr>
+                    <a:xfrm>
+                      <a:off x="0" y="0"/>
+                      <a:ext cx="4572000" cy="2652478"/>
+                    </a:xfrm>
+                    <a:prstGeom prst="rect"/>
+                  </pic:spPr>
+                </pic:pic>
+              </a:graphicData>
+            </a:graphic>
+          </wp:inline>
+        </w:drawing>
+      </w:r>
+    </w:p>
+    <w:p>
+      <w:r>
+        <w:rPr>
+          <w:i/>
+        </w:rPr>
+        <w:t>Figure 6: Inference Speed Comparison</w:t>
+      </w:r>
+    </w:p>
     <w:sectPr>
       <w:pgSz w:w="12240" w:h="15840"/>
       <w:pgMar w:top="1440" w:right="1800" w:bottom="1440" w:left="1800" w:header="720" w:footer="720" w:gutter="0"/>

</xml_diff>

<commit_message>
Update DOCX report with optimized A4-format figures
</commit_message>
<xml_diff>
--- a/ISY5004_project_report.docx
+++ b/ISY5004_project_report.docx
@@ -2258,14 +2258,6 @@
     </w:p>
     <w:p>
       <w:r>
-        <w:rPr>
-          <w:i/>
-        </w:rPr>
-        <w:t>Figure 5: Surface Detection Analysis</w:t>
-      </w:r>
-    </w:p>
-    <w:p>
-      <w:r>
         <w:drawing>
           <wp:inline xmlns:a="http://schemas.openxmlformats.org/drawingml/2006/main" xmlns:pic="http://schemas.openxmlformats.org/drawingml/2006/picture">
             <wp:extent cx="4572000" cy="2652478"/>
@@ -2301,11 +2293,159 @@
       </w:r>
     </w:p>
     <w:p>
+      <w:pPr>
+        <w:jc w:val="center"/>
+      </w:pPr>
+      <w:r>
+        <w:drawing>
+          <wp:inline xmlns:a="http://schemas.openxmlformats.org/drawingml/2006/main" xmlns:pic="http://schemas.openxmlformats.org/drawingml/2006/picture">
+            <wp:extent cx="4389120" cy="3123674"/>
+            <wp:docPr id="6" name="Picture 6"/>
+            <wp:cNvGraphicFramePr>
+              <a:graphicFrameLocks noChangeAspect="1"/>
+            </wp:cNvGraphicFramePr>
+            <a:graphic>
+              <a:graphicData uri="http://schemas.openxmlformats.org/drawingml/2006/picture">
+                <pic:pic>
+                  <pic:nvPicPr>
+                    <pic:cNvPr id="0" name="01_system_architecture.png"/>
+                    <pic:cNvPicPr/>
+                  </pic:nvPicPr>
+                  <pic:blipFill>
+                    <a:blip r:embed="rId14"/>
+                    <a:stretch>
+                      <a:fillRect/>
+                    </a:stretch>
+                  </pic:blipFill>
+                  <pic:spPr>
+                    <a:xfrm>
+                      <a:off x="0" y="0"/>
+                      <a:ext cx="4389120" cy="3123674"/>
+                    </a:xfrm>
+                    <a:prstGeom prst="rect"/>
+                  </pic:spPr>
+                </pic:pic>
+              </a:graphicData>
+            </a:graphic>
+          </wp:inline>
+        </w:drawing>
+      </w:r>
+    </w:p>
+    <w:p>
+      <w:pPr>
+        <w:spacing w:after="240"/>
+        <w:jc w:val="center"/>
+      </w:pPr>
       <w:r>
         <w:rPr>
           <w:i/>
+          <w:sz w:val="18"/>
         </w:rPr>
-        <w:t>Figure 6: Inference Speed Comparison</w:t>
+        <w:t>Figure 1: System Architecture (5 models + Flask backend)</w:t>
+      </w:r>
+    </w:p>
+    <w:p>
+      <w:pPr>
+        <w:jc w:val="center"/>
+      </w:pPr>
+      <w:r>
+        <w:drawing>
+          <wp:inline xmlns:a="http://schemas.openxmlformats.org/drawingml/2006/main" xmlns:pic="http://schemas.openxmlformats.org/drawingml/2006/picture">
+            <wp:extent cx="4389120" cy="3560434"/>
+            <wp:docPr id="7" name="Picture 7"/>
+            <wp:cNvGraphicFramePr>
+              <a:graphicFrameLocks noChangeAspect="1"/>
+            </wp:cNvGraphicFramePr>
+            <a:graphic>
+              <a:graphicData uri="http://schemas.openxmlformats.org/drawingml/2006/picture">
+                <pic:pic>
+                  <pic:nvPicPr>
+                    <pic:cNvPr id="0" name="02_model_comparison.png"/>
+                    <pic:cNvPicPr/>
+                  </pic:nvPicPr>
+                  <pic:blipFill>
+                    <a:blip r:embed="rId15"/>
+                    <a:stretch>
+                      <a:fillRect/>
+                    </a:stretch>
+                  </pic:blipFill>
+                  <pic:spPr>
+                    <a:xfrm>
+                      <a:off x="0" y="0"/>
+                      <a:ext cx="4389120" cy="3560434"/>
+                    </a:xfrm>
+                    <a:prstGeom prst="rect"/>
+                  </pic:spPr>
+                </pic:pic>
+              </a:graphicData>
+            </a:graphic>
+          </wp:inline>
+        </w:drawing>
+      </w:r>
+    </w:p>
+    <w:p>
+      <w:pPr>
+        <w:spacing w:after="240"/>
+        <w:jc w:val="center"/>
+      </w:pPr>
+      <w:r>
+        <w:rPr>
+          <w:i/>
+          <w:sz w:val="18"/>
+        </w:rPr>
+        <w:t>Figure 2: MiDaS vs Depth Anything V2 Comparison (selected MiDaS for speed-accuracy tradeoff)</w:t>
+      </w:r>
+    </w:p>
+    <w:p>
+      <w:pPr>
+        <w:jc w:val="center"/>
+      </w:pPr>
+      <w:r>
+        <w:drawing>
+          <wp:inline xmlns:a="http://schemas.openxmlformats.org/drawingml/2006/main" xmlns:pic="http://schemas.openxmlformats.org/drawingml/2006/picture">
+            <wp:extent cx="4389120" cy="3649094"/>
+            <wp:docPr id="8" name="Picture 8"/>
+            <wp:cNvGraphicFramePr>
+              <a:graphicFrameLocks noChangeAspect="1"/>
+            </wp:cNvGraphicFramePr>
+            <a:graphic>
+              <a:graphicData uri="http://schemas.openxmlformats.org/drawingml/2006/picture">
+                <pic:pic>
+                  <pic:nvPicPr>
+                    <pic:cNvPr id="0" name="03_performance_detailed.png"/>
+                    <pic:cNvPicPr/>
+                  </pic:nvPicPr>
+                  <pic:blipFill>
+                    <a:blip r:embed="rId16"/>
+                    <a:stretch>
+                      <a:fillRect/>
+                    </a:stretch>
+                  </pic:blipFill>
+                  <pic:spPr>
+                    <a:xfrm>
+                      <a:off x="0" y="0"/>
+                      <a:ext cx="4389120" cy="3649094"/>
+                    </a:xfrm>
+                    <a:prstGeom prst="rect"/>
+                  </pic:spPr>
+                </pic:pic>
+              </a:graphicData>
+            </a:graphic>
+          </wp:inline>
+        </w:drawing>
+      </w:r>
+    </w:p>
+    <w:p>
+      <w:pPr>
+        <w:spacing w:after="240"/>
+        <w:jc w:val="center"/>
+      </w:pPr>
+      <w:r>
+        <w:rPr>
+          <w:i/>
+          <w:sz w:val="18"/>
+        </w:rPr>
+        <w:t>Figure 3: Performance Metrics with 3.9× GPU speedup</w:t>
       </w:r>
     </w:p>
     <w:sectPr>

</xml_diff>